<commit_message>
Scope of work for quotation: candidate versions twa_8h 1.3.0 and stel_15 1.2.0; conventions to confirm
Co-Authored-By: Claude Opus 5.5 <noreply@anthropic.com>
Claude-Session: https://claude.ai/code/session_01EGbDpioVJwuFMLCLJJKFS3
</commit_message>
<xml_diff>
--- a/docs/procurement/Scope-of-Work-Professional-Review.docx
+++ b/docs/procurement/Scope-of-Work-Professional-Review.docx
@@ -190,24 +190,24 @@
           <w:sz w:val="21"/>
           <w:szCs w:val="21"/>
         </w:rPr>
-        <w:t xml:space="preserve">Eight-hour time-weighted average: twa_8h 1.2.1.</w:t>
-      </w:r>
-    </w:p>
-    <w:p>
-      <w:pPr>
-        <w:pStyle w:val="ListParagraph"/>
-        <w:numPr>
-          <w:ilvl w:val="0"/>
-          <w:numId w:val="2"/>
-        </w:numPr>
-        <w:spacing w:after="60"/>
-      </w:pPr>
-      <w:r>
-        <w:rPr>
-          <w:sz w:val="21"/>
-          <w:szCs w:val="21"/>
-        </w:rPr>
-        <w:t xml:space="preserve">Fifteen-minute short-term exposure: stel_15 1.1.1, where applicable.</w:t>
+        <w:t xml:space="preserve">Eight-hour time-weighted average: twa_8h 1.3.0.</w:t>
+      </w:r>
+    </w:p>
+    <w:p>
+      <w:pPr>
+        <w:pStyle w:val="ListParagraph"/>
+        <w:numPr>
+          <w:ilvl w:val="0"/>
+          <w:numId w:val="2"/>
+        </w:numPr>
+        <w:spacing w:after="60"/>
+      </w:pPr>
+      <w:r>
+        <w:rPr>
+          <w:sz w:val="21"/>
+          <w:szCs w:val="21"/>
+        </w:rPr>
+        <w:t xml:space="preserve">Fifteen-minute short-term exposure: stel_15 1.2.0, where applicable.</w:t>
       </w:r>
     </w:p>
     <w:p>
@@ -236,6 +236,133 @@
           <w:sz w:val="21"/>
           <w:szCs w:val="21"/>
         </w:rPr>
+        <w:t xml:space="preserve">These versions (calculation engine 1.4.0) replace twa_8h 1.2.1 and stel_15 1.1.1 following a technical review on 22 October 2026. Neither earlier version was approved; no approval carries over between versions.</w:t>
+      </w:r>
+    </w:p>
+    <w:p>
+      <w:pPr>
+        <w:keepNext/>
+        <w:spacing w:after="120"/>
+      </w:pPr>
+      <w:r>
+        <w:rPr>
+          <w:sz w:val="21"/>
+          <w:szCs w:val="21"/>
+        </w:rPr>
+        <w:t xml:space="preserve">Confirm or change the conventions introduced in these versions:</w:t>
+      </w:r>
+    </w:p>
+    <w:p>
+      <w:pPr>
+        <w:pStyle w:val="ListParagraph"/>
+        <w:numPr>
+          <w:ilvl w:val="0"/>
+          <w:numId w:val="2"/>
+        </w:numPr>
+        <w:spacing w:after="60"/>
+      </w:pPr>
+      <w:r>
+        <w:rPr>
+          <w:sz w:val="21"/>
+          <w:szCs w:val="21"/>
+        </w:rPr>
+        <w:t xml:space="preserve">Short-term results only from an uninterrupted sample of exactly 15 minutes, with no sampling tolerance; shorter samples only with a documented zero-remainder assumption supported by evidence.</w:t>
+      </w:r>
+    </w:p>
+    <w:p>
+      <w:pPr>
+        <w:pStyle w:val="ListParagraph"/>
+        <w:numPr>
+          <w:ilvl w:val="0"/>
+          <w:numId w:val="2"/>
+        </w:numPr>
+        <w:spacing w:after="60"/>
+      </w:pPr>
+      <w:r>
+        <w:rPr>
+          <w:sz w:val="21"/>
+          <w:szCs w:val="21"/>
+        </w:rPr>
+        <w:t xml:space="preserve">A generic "less than LOQ" result carried as zero to the LOQ unless the laboratory confirms detection.</w:t>
+      </w:r>
+    </w:p>
+    <w:p>
+      <w:pPr>
+        <w:pStyle w:val="ListParagraph"/>
+        <w:numPr>
+          <w:ilvl w:val="0"/>
+          <w:numId w:val="2"/>
+        </w:numPr>
+        <w:spacing w:after="60"/>
+      </w:pPr>
+      <w:r>
+        <w:rPr>
+          <w:sz w:val="21"/>
+          <w:szCs w:val="21"/>
+        </w:rPr>
+        <w:t xml:space="preserve">The consequence of each method acceptance failure (advisory, disposition required or invalid) for each method version, and the flow rate used to calculate air volume.</w:t>
+      </w:r>
+    </w:p>
+    <w:p>
+      <w:pPr>
+        <w:pStyle w:val="ListParagraph"/>
+        <w:numPr>
+          <w:ilvl w:val="0"/>
+          <w:numId w:val="2"/>
+        </w:numPr>
+        <w:spacing w:after="60"/>
+      </w:pPr>
+      <w:r>
+        <w:rPr>
+          <w:sz w:val="21"/>
+          <w:szCs w:val="21"/>
+        </w:rPr>
+        <w:t xml:space="preserve">The molar volume used for ppm to mg/m3 conversion (24.05526 L/mol, EH40 paragraph 68).</w:t>
+      </w:r>
+    </w:p>
+    <w:p>
+      <w:pPr>
+        <w:pStyle w:val="ListParagraph"/>
+        <w:numPr>
+          <w:ilvl w:val="0"/>
+          <w:numId w:val="2"/>
+        </w:numPr>
+        <w:spacing w:after="60"/>
+      </w:pPr>
+      <w:r>
+        <w:rPr>
+          <w:sz w:val="21"/>
+          <w:szCs w:val="21"/>
+        </w:rPr>
+        <w:t xml:space="preserve">The rules for setting aside excluded or indicative evidence, and the resulting comparison states.</w:t>
+      </w:r>
+    </w:p>
+    <w:p>
+      <w:pPr>
+        <w:pStyle w:val="ListParagraph"/>
+        <w:numPr>
+          <w:ilvl w:val="0"/>
+          <w:numId w:val="2"/>
+        </w:numPr>
+        <w:spacing w:after="60"/>
+      </w:pPr>
+      <w:r>
+        <w:rPr>
+          <w:sz w:val="21"/>
+          <w:szCs w:val="21"/>
+        </w:rPr>
+        <w:t xml:space="preserve">The rules for associating samples with shifts and for checking exposure duration against task records.</w:t>
+      </w:r>
+    </w:p>
+    <w:p>
+      <w:pPr>
+        <w:spacing w:after="120"/>
+      </w:pPr>
+      <w:r>
+        <w:rPr>
+          <w:sz w:val="21"/>
+          <w:szCs w:val="21"/>
+        </w:rPr>
         <w:t xml:space="preserve">Identify assumptions, restrictions and circumstances in which outputs should not be used.</w:t>
       </w:r>
     </w:p>
@@ -248,7 +375,7 @@
           <w:sz w:val="21"/>
           <w:szCs w:val="21"/>
         </w:rPr>
-        <w:t xml:space="preserve">Review and provide a documented disposition for finding H1-F01. The finding affected both candidate methods (corrected in twa_8h 1.2.1 and stel_15 1.1.1): where no formal result could be calculated, the overall comparison was reported as "not comparable" instead of "indeterminate".</w:t>
+        <w:t xml:space="preserve">Review and provide a documented disposition for finding H1-F01. The finding affected both candidate methods (corrected in twa_8h 1.2.1 and stel_15 1.1.1, and retained in 1.3.0 and 1.2.0): where no formal result could be calculated, the overall comparison was reported as "not comparable" instead of "indeterminate".</w:t>
       </w:r>
     </w:p>
     <w:p>
@@ -1065,6 +1192,23 @@
           <w:szCs w:val="21"/>
         </w:rPr>
         <w:t xml:space="preserve">Professional review handover pack, including the H1-F01 brief.</w:t>
+      </w:r>
+    </w:p>
+    <w:p>
+      <w:pPr>
+        <w:pStyle w:val="ListParagraph"/>
+        <w:numPr>
+          <w:ilvl w:val="0"/>
+          <w:numId w:val="2"/>
+        </w:numPr>
+        <w:spacing w:after="60"/>
+      </w:pPr>
+      <w:r>
+        <w:rPr>
+          <w:sz w:val="21"/>
+          <w:szCs w:val="21"/>
+        </w:rPr>
+        <w:t xml:space="preserve">Remediation summary for calculation engine 1.4.0, with structured worked examples and independently derived expected results.</w:t>
       </w:r>
     </w:p>
     <w:p>

</xml_diff>

<commit_message>
Engine 1.5.0 documentation: specification §0.9–0.10, findings register §7.2 (TR-06, TR-07 implemented — awaiting technical re-review), remediation summary, test evidence (311 tests, 28 migrations), readiness report, review pack, handover, decision pack P8, gate register G3, scope of work for quotation (twa_8h 1.4.0, stel_15 1.3.0); re-review package builder for 1.5.0
Co-Authored-By: Claude Opus 5.5 <noreply@anthropic.com>
Claude-Session: https://claude.ai/code/session_01EGbDpioVJwuFMLCLJJKFS3
</commit_message>
<xml_diff>
--- a/docs/procurement/Scope-of-Work-Professional-Review.docx
+++ b/docs/procurement/Scope-of-Work-Professional-Review.docx
@@ -190,24 +190,24 @@
           <w:sz w:val="21"/>
           <w:szCs w:val="21"/>
         </w:rPr>
-        <w:t xml:space="preserve">Eight-hour time-weighted average: twa_8h 1.3.0.</w:t>
-      </w:r>
-    </w:p>
-    <w:p>
-      <w:pPr>
-        <w:pStyle w:val="ListParagraph"/>
-        <w:numPr>
-          <w:ilvl w:val="0"/>
-          <w:numId w:val="2"/>
-        </w:numPr>
-        <w:spacing w:after="60"/>
-      </w:pPr>
-      <w:r>
-        <w:rPr>
-          <w:sz w:val="21"/>
-          <w:szCs w:val="21"/>
-        </w:rPr>
-        <w:t xml:space="preserve">Fifteen-minute short-term exposure: stel_15 1.2.0, where applicable.</w:t>
+        <w:t xml:space="preserve">Eight-hour time-weighted average: twa_8h 1.4.0.</w:t>
+      </w:r>
+    </w:p>
+    <w:p>
+      <w:pPr>
+        <w:pStyle w:val="ListParagraph"/>
+        <w:numPr>
+          <w:ilvl w:val="0"/>
+          <w:numId w:val="2"/>
+        </w:numPr>
+        <w:spacing w:after="60"/>
+      </w:pPr>
+      <w:r>
+        <w:rPr>
+          <w:sz w:val="21"/>
+          <w:szCs w:val="21"/>
+        </w:rPr>
+        <w:t xml:space="preserve">Fifteen-minute short-term exposure: stel_15 1.3.0, where applicable.</w:t>
       </w:r>
     </w:p>
     <w:p>
@@ -236,7 +236,7 @@
           <w:sz w:val="21"/>
           <w:szCs w:val="21"/>
         </w:rPr>
-        <w:t xml:space="preserve">These versions (calculation engine 1.4.0) replace twa_8h 1.2.1 and stel_15 1.1.1 following a technical review on 22 October 2026. Neither earlier version was approved; no approval carries over between versions.</w:t>
+        <w:t xml:space="preserve">These versions (calculation engine 1.5.0) replace twa_8h 1.3.0 and stel_15 1.2.0, which in turn replaced twa_8h 1.2.1 and stel_15 1.1.1, following technical reviews on 22 October 2026. No earlier version was approved; no approval carries over between versions.</w:t>
       </w:r>
     </w:p>
     <w:p>
@@ -356,6 +356,40 @@
     </w:p>
     <w:p>
       <w:pPr>
+        <w:pStyle w:val="ListParagraph"/>
+        <w:numPr>
+          <w:ilvl w:val="0"/>
+          <w:numId w:val="2"/>
+        </w:numPr>
+        <w:spacing w:after="60"/>
+      </w:pPr>
+      <w:r>
+        <w:rPr>
+          <w:sz w:val="21"/>
+          <w:szCs w:val="21"/>
+        </w:rPr>
+        <w:t xml:space="preserve">The rules for treating a sample as a duplicate: a second record of the same sampling event, or a paired or co-located sampler, each with the relationship evidence required; the time-window thresholds (within 1 minute; at least 90 % overlap); and the rule that a higher paired result is not set aside as a duplicate. A different sample offered as evidence of adequate coverage is treated as a reviewer's judgement, not as a duplicate.</w:t>
+      </w:r>
+    </w:p>
+    <w:p>
+      <w:pPr>
+        <w:pStyle w:val="ListParagraph"/>
+        <w:numPr>
+          <w:ilvl w:val="0"/>
+          <w:numId w:val="2"/>
+        </w:numPr>
+        <w:spacing w:after="60"/>
+      </w:pPr>
+      <w:r>
+        <w:rPr>
+          <w:sz w:val="21"/>
+          <w:szCs w:val="21"/>
+        </w:rPr>
+        <w:t xml:space="preserve">The meaning of the laboratory's numeric value for each result qualifier, in particular that a "detected below LOQ" value must lie between the LOD and the LOQ (inclusive) or equal the LOQ when it is a reporting threshold, and that contradictory results are refused pending laboratory clarification.</w:t>
+      </w:r>
+    </w:p>
+    <w:p>
+      <w:pPr>
         <w:spacing w:after="120"/>
       </w:pPr>
       <w:r>
@@ -375,7 +409,7 @@
           <w:sz w:val="21"/>
           <w:szCs w:val="21"/>
         </w:rPr>
-        <w:t xml:space="preserve">Review and provide a documented disposition for finding H1-F01. The finding affected both candidate methods (corrected in twa_8h 1.2.1 and stel_15 1.1.1, and retained in 1.3.0 and 1.2.0): where no formal result could be calculated, the overall comparison was reported as "not comparable" instead of "indeterminate".</w:t>
+        <w:t xml:space="preserve">Review and provide a documented disposition for finding H1-F01. The finding affected both candidate methods (corrected in twa_8h 1.2.1 and stel_15 1.1.1, and retained in all later versions): where no formal result could be calculated, the overall comparison was reported as "not comparable" instead of "indeterminate".</w:t>
       </w:r>
     </w:p>
     <w:p>
@@ -1208,7 +1242,7 @@
           <w:sz w:val="21"/>
           <w:szCs w:val="21"/>
         </w:rPr>
-        <w:t xml:space="preserve">Remediation summary for calculation engine 1.4.0, with structured worked examples and independently derived expected results.</w:t>
+        <w:t xml:space="preserve">Remediation summaries for calculation engines 1.4.0 and 1.5.0, with structured worked examples and independently derived expected results.</w:t>
       </w:r>
     </w:p>
     <w:p>

</xml_diff>

<commit_message>
Engine 1.5.1 documentation: specification §0.9 amended and §0.11 (sample-list removals), findings register §7.3 (R5), remediation summary §8, test evidence (320 tests, 29 migrations), readiness report, review pack, handover, decision pack, gate register, catalogue, scope of work (twa_8h 1.4.1, stel_15 1.3.1); package builder 1.5.1
Co-Authored-By: Claude Opus 5.5 <noreply@anthropic.com>
Claude-Session: https://claude.ai/code/session_01EGbDpioVJwuFMLCLJJKFS3
</commit_message>
<xml_diff>
--- a/docs/procurement/Scope-of-Work-Professional-Review.docx
+++ b/docs/procurement/Scope-of-Work-Professional-Review.docx
@@ -190,24 +190,24 @@
           <w:sz w:val="21"/>
           <w:szCs w:val="21"/>
         </w:rPr>
-        <w:t xml:space="preserve">Eight-hour time-weighted average: twa_8h 1.4.0.</w:t>
-      </w:r>
-    </w:p>
-    <w:p>
-      <w:pPr>
-        <w:pStyle w:val="ListParagraph"/>
-        <w:numPr>
-          <w:ilvl w:val="0"/>
-          <w:numId w:val="2"/>
-        </w:numPr>
-        <w:spacing w:after="60"/>
-      </w:pPr>
-      <w:r>
-        <w:rPr>
-          <w:sz w:val="21"/>
-          <w:szCs w:val="21"/>
-        </w:rPr>
-        <w:t xml:space="preserve">Fifteen-minute short-term exposure: stel_15 1.3.0, where applicable.</w:t>
+        <w:t xml:space="preserve">Eight-hour time-weighted average: twa_8h 1.4.1.</w:t>
+      </w:r>
+    </w:p>
+    <w:p>
+      <w:pPr>
+        <w:pStyle w:val="ListParagraph"/>
+        <w:numPr>
+          <w:ilvl w:val="0"/>
+          <w:numId w:val="2"/>
+        </w:numPr>
+        <w:spacing w:after="60"/>
+      </w:pPr>
+      <w:r>
+        <w:rPr>
+          <w:sz w:val="21"/>
+          <w:szCs w:val="21"/>
+        </w:rPr>
+        <w:t xml:space="preserve">Fifteen-minute short-term exposure: stel_15 1.3.1, where applicable.</w:t>
       </w:r>
     </w:p>
     <w:p>
@@ -236,7 +236,7 @@
           <w:sz w:val="21"/>
           <w:szCs w:val="21"/>
         </w:rPr>
-        <w:t xml:space="preserve">These versions (calculation engine 1.5.0) replace twa_8h 1.3.0 and stel_15 1.2.0, which in turn replaced twa_8h 1.2.1 and stel_15 1.1.1, following technical reviews on 22 October 2026. No earlier version was approved; no approval carries over between versions.</w:t>
+        <w:t xml:space="preserve">These versions (calculation engine 1.5.1) replace earlier unapproved versions (twa_8h 1.2.1 to 1.4.0 and stel_15 1.1.1 to 1.3.0) following technical reviews on 22 October 2026. No earlier version was approved; no approval carries over between versions.</w:t>
       </w:r>
     </w:p>
     <w:p>
@@ -368,7 +368,24 @@
           <w:sz w:val="21"/>
           <w:szCs w:val="21"/>
         </w:rPr>
-        <w:t xml:space="preserve">The rules for treating a sample as a duplicate: a second record of the same sampling event, or a paired or co-located sampler, each with the relationship evidence required; the time-window thresholds (within 1 minute; at least 90 % overlap); and the rule that a higher paired result is not set aside as a duplicate. A different sample offered as evidence of adequate coverage is treated as a reviewer's judgement, not as a duplicate.</w:t>
+        <w:t xml:space="preserve">The rules for treating a sample as a duplicate: a second record of the same sampling event, or a paired or co-located sampler, each with the relationship evidence required; the time-window thresholds (within 1 minute; at least 90 % overlap); and the rule that a higher paired result is not set aside as a duplicate. A different sample offered as evidence of adequate coverage is treated as a reviewer's judgement, not as a duplicate, and a result that cannot be calculated is never set aside as a duplicate.</w:t>
+      </w:r>
+    </w:p>
+    <w:p>
+      <w:pPr>
+        <w:pStyle w:val="ListParagraph"/>
+        <w:numPr>
+          <w:ilvl w:val="0"/>
+          <w:numId w:val="2"/>
+        </w:numPr>
+        <w:spacing w:after="60"/>
+      </w:pPr>
+      <w:r>
+        <w:rPr>
+          <w:sz w:val="21"/>
+          <w:szCs w:val="21"/>
+        </w:rPr>
+        <w:t xml:space="preserve">That removing a sample from an assessment is a scope decision confirmed by a technical reviewer.</w:t>
       </w:r>
     </w:p>
     <w:p>
@@ -1242,7 +1259,7 @@
           <w:sz w:val="21"/>
           <w:szCs w:val="21"/>
         </w:rPr>
-        <w:t xml:space="preserve">Remediation summaries for calculation engines 1.4.0 and 1.5.0, with structured worked examples and independently derived expected results.</w:t>
+        <w:t xml:space="preserve">Remediation summaries for calculation engines 1.4.0 and 1.5.0/1.5.1, with structured worked examples and independently derived expected results.</w:t>
       </w:r>
     </w:p>
     <w:p>

</xml_diff>